<commit_message>
docs: fix residual NCC TRN reference in §1.15 Algorithm Summary — V7.2
Co-Authored-By: Claude Sonnet 4.6 <noreply@anthropic.com>
</commit_message>
<xml_diff>
--- a/docs/qa/MicroMind_PartTwo_V7_2.docx
+++ b/docs/qa/MicroMind_PartTwo_V7_2.docx
@@ -22059,12 +22059,7 @@
           </w:tcPr>
           <w:p>
             <w:r>
-              <w:rPr>
-                <w:color w:val="1A1A1A"/>
-                <w:sz w:val="19"/>
-                <w:szCs w:val="19"/>
-              </w:rPr>
-              <w:t>Normalised Cross-Correlation TRN; Kalman-corrected DEM matching</w:t>
+              <w:t>Orthophoto Image Matching (2D NCC on optical patches); L2 Absolute Reset; Kalman-corrected position injection into ESKF</w:t>
             </w:r>
           </w:p>
         </w:tc>

</xml_diff>